<commit_message>
feat: deploy static page via GitHub Pages and attach live links to final submission PDF
</commit_message>
<xml_diff>
--- a/BeaconGrid_Final_Submission.docx
+++ b/BeaconGrid_Final_Submission.docx
@@ -429,7 +429,57 @@
                 <w:sz w:val="20"/>
                 <w:szCs w:val="20"/>
               </w:rPr>
-              <w:t xml:space="preserve">PROJECT REPOSITORY &amp; CONVERSATION ARTIFACTS</w:t>
+              <w:t xml:space="preserve">PROJECT REPOSITORY, LIVE DEPLOYMENT &amp; ARTIFACTS</w:t>
+            </w:r>
+          </w:p>
+          <w:p>
+            <w:pPr>
+              <w:spacing w:after="30" w:before="30"/>
+            </w:pPr>
+            <w:r>
+              <w:rPr>
+                <w:b/>
+                <w:bCs/>
+                <w:color w:val="0F172A"/>
+                <w:sz w:val="20"/>
+                <w:szCs w:val="20"/>
+              </w:rPr>
+              <w:t xml:space="preserve">🚀 Live Static Web Portal (GitHub Pages): </w:t>
+            </w:r>
+            <w:r>
+              <w:rPr>
+                <w:b/>
+                <w:bCs/>
+                <w:color w:val="EA580C"/>
+                <w:sz w:val="20"/>
+                <w:szCs w:val="20"/>
+              </w:rPr>
+              <w:t xml:space="preserve">https://sathya-sai-s.github.io/Becongrid/</w:t>
+            </w:r>
+          </w:p>
+          <w:p>
+            <w:pPr>
+              <w:spacing w:after="30" w:before="30"/>
+            </w:pPr>
+            <w:r>
+              <w:rPr>
+                <w:b/>
+                <w:bCs/>
+                <w:color w:val="0F172A"/>
+                <w:sz w:val="20"/>
+                <w:szCs w:val="20"/>
+              </w:rPr>
+              <w:t xml:space="preserve">🗺️ Live Tactical Command Map: </w:t>
+            </w:r>
+            <w:r>
+              <w:rPr>
+                <w:b/>
+                <w:bCs/>
+                <w:color w:val="2563EB"/>
+                <w:sz w:val="20"/>
+                <w:szCs w:val="20"/>
+              </w:rPr>
+              <w:t xml:space="preserve">https://sathya-sai-s.github.io/Becongrid/map.html</w:t>
             </w:r>
           </w:p>
           <w:p>
@@ -1020,7 +1070,7 @@
                 <w:sz w:val="20"/>
                 <w:szCs w:val="20"/>
               </w:rPr>
-              <w:t xml:space="preserve">🔗 Official Git Deployment &amp; Remote Repository</w:t>
+              <w:t xml:space="preserve">🔗 Official Git Deployment &amp; Live Static Page Links</w:t>
             </w:r>
           </w:p>
           <w:p>
@@ -1034,10 +1084,11 @@
                 <w:sz w:val="19"/>
                 <w:szCs w:val="19"/>
               </w:rPr>
-              <w:t xml:space="preserve">Repository URL: https://github.com/SATHYA-SAI-S/Becongrid
-Branch: main | Commit Version: Production Release v2.0.0
-Git Remote Origin: https://github.com/SATHYA-SAI-S/Becongrid.git
-License: MIT Open Source | Deployed Runtime: Node.js (v20+), Express.js, MongoDB / In-Memory GeoJSON</w:t>
+              <w:t xml:space="preserve">• Live Static Web Portal: https://sathya-sai-s.github.io/Becongrid/
+• Live Tactical Command Map: https://sathya-sai-s.github.io/Becongrid/map.html
+• GitHub Source Repository: https://github.com/SATHYA-SAI-S/Becongrid
+• Deployment Branches: main (Production) &amp; gh-pages (GitHub Pages Static Host)
+• License: MIT Open Source | Deployed Runtime: Static HTML5 / Vanilla ES Modules / Leaflet Engine / Node.js Express</w:t>
             </w:r>
           </w:p>
         </w:tc>
@@ -4879,6 +4930,65 @@
           </w:p>
         </w:tc>
       </w:tr>
+      <w:tr>
+        <w:tc>
+          <w:tcPr>
+            <w:shd w:fill="FFFFFF" w:val="clear"/>
+            <w:tcMar>
+              <w:top w:type="dxa" w:w="80"/>
+              <w:left w:type="dxa" w:w="120"/>
+              <w:bottom w:type="dxa" w:w="80"/>
+              <w:right w:type="dxa" w:w="120"/>
+            </w:tcMar>
+          </w:tcPr>
+          <w:p>
+            <w:r>
+              <w:rPr>
+                <w:b/>
+                <w:bCs/>
+              </w:rPr>
+              <w:t xml:space="preserve">Static Web Deployment</w:t>
+            </w:r>
+          </w:p>
+        </w:tc>
+        <w:tc>
+          <w:tcPr>
+            <w:shd w:fill="FFFFFF" w:val="clear"/>
+            <w:tcMar>
+              <w:top w:type="dxa" w:w="80"/>
+              <w:left w:type="dxa" w:w="120"/>
+              <w:bottom w:type="dxa" w:w="80"/>
+              <w:right w:type="dxa" w:w="120"/>
+            </w:tcMar>
+          </w:tcPr>
+          <w:p>
+            <w:r>
+              <w:t xml:space="preserve">Live static page hosted on GitHub Pages with full interactive map</w:t>
+            </w:r>
+          </w:p>
+        </w:tc>
+        <w:tc>
+          <w:tcPr>
+            <w:shd w:fill="FFFFFF" w:val="clear"/>
+            <w:tcMar>
+              <w:top w:type="dxa" w:w="80"/>
+              <w:left w:type="dxa" w:w="120"/>
+              <w:bottom w:type="dxa" w:w="80"/>
+              <w:right w:type="dxa" w:w="120"/>
+            </w:tcMar>
+          </w:tcPr>
+          <w:p>
+            <w:r>
+              <w:rPr>
+                <w:b/>
+                <w:bCs/>
+                <w:color w:val="2563EB"/>
+              </w:rPr>
+              <w:t xml:space="preserve">✔ Deployed at https://sathya-sai-s.github.io/Becongrid/</w:t>
+            </w:r>
+          </w:p>
+        </w:tc>
+      </w:tr>
     </w:tbl>
     <w:p>
       <w:pPr>
@@ -4938,10 +5048,12 @@
                 <w:sz w:val="19"/>
                 <w:szCs w:val="19"/>
               </w:rPr>
-              <w:t xml:space="preserve">GitHub Repository: https://github.com/SATHYA-SAI-S/Becongrid
-AI Prompts &amp; Full Conversation Archive: https://drive.google.com/file/d/1_J1iH8bvif2vKBPjXDVEwQ2uck7Zk7MB/view?usp=sharing
-Submission Document: BeaconGrid_Final_Submission.pdf (and Becon_Gird_Final_Submission.pdf)
-Timestamp: October 27, 2026 | Department of Advanced Web Technologies</w:t>
+              <w:t xml:space="preserve">• Live Static Web Portal: https://sathya-sai-s.github.io/Becongrid/
+• Live Tactical Command Map: https://sathya-sai-s.github.io/Becongrid/map.html
+• GitHub Source Repository: https://github.com/SATHYA-SAI-S/Becongrid
+• AI Prompts &amp; Full Conversation Archive: https://drive.google.com/file/d/1_J1iH8bvif2vKBPjXDVEwQ2uck7Zk7MB/view?usp=sharing
+• Final Submission Document: BeaconGrid_Final_Submission.pdf (and Becon_Gird_Final_Submission.pdf)
+• Academic Year: 2026-2027 | Department of Advanced Web Technologies</w:t>
             </w:r>
           </w:p>
         </w:tc>

</xml_diff>